<commit_message>
Fix CV portfolio link: davidpayan.dev doesn't resolve, revert to the working Vercel URL
The custom domain was assumed live because it was already set as the
canonical/og:url in index.html, but it doesn't actually resolve
(confirmed via DNS lookup). That made the previous commit's "fix" a
regression — it replaced a working link with a broken one. Reverting
the CV header to portfolio-kappa-one-99.vercel.app until the domain
situation is confirmed and, if needed, actually configured.
</commit_message>
<xml_diff>
--- a/public/CV_David_Payan_EN.docx
+++ b/public/CV_David_Payan_EN.docx
@@ -47,7 +47,7 @@
         <w:spacing w:after="90"/>
         <w:jc w:val="center"/>
       </w:pPr>
-      <w:hyperlink r:id="rId7">
+      <w:hyperlink r:id="rId7iu0fbg8uxjsyx7e0xhuh">
         <w:r>
           <w:rPr>
             <w:rFonts w:ascii="Calibri" w:cs="Calibri" w:eastAsia="Calibri" w:hAnsi="Calibri"/>
@@ -57,7 +57,7 @@
             <w:u w:val="single"/>
             <w:rtl w:val="0"/>
           </w:rPr>
-          <w:t xml:space="preserve">davidpayan.dev</w:t>
+          <w:t xml:space="preserve">portfolio-kappa-one-99.vercel.app</w:t>
         </w:r>
       </w:hyperlink>
       <w:r>

</xml_diff>

<commit_message>
Add a Personal Projects section to the CV: SignageFlow and the freelance app
Both were already added to the portfolio but missing from the CV,
which meant a recruiter reading the CV first would never see the
freelance/independent-initiative story. Kept as its own section,
separate from Kong Consulting client work, to keep the distinction
clear.
</commit_message>
<xml_diff>
--- a/public/CV_David_Payan_EN.docx
+++ b/public/CV_David_Payan_EN.docx
@@ -579,6 +579,89 @@
           <w:szCs w:val="21"/>
         </w:rPr>
         <w:t xml:space="preserve">Created a mobile app for managing work orders in construction, integrated with the ERP system for seamless data sync, task updates, and report generation.</w:t>
+      </w:r>
+    </w:p>
+    <w:p>
+      <w:pPr>
+        <w:pBdr>
+          <w:top w:val="single" w:color="999999" w:sz="6"/>
+        </w:pBdr>
+        <w:spacing w:after="110" w:before="160"/>
+        <w:jc w:val="center"/>
+        <w:keepNext/>
+      </w:pPr>
+      <w:r>
+        <w:rPr>
+          <w:rFonts w:ascii="Calibri" w:cs="Calibri" w:eastAsia="Calibri" w:hAnsi="Calibri"/>
+          <w:b/>
+          <w:bCs/>
+          <w:color w:val="1A1A1A"/>
+          <w:sz w:val="24"/>
+          <w:szCs w:val="24"/>
+        </w:rPr>
+        <w:t xml:space="preserve">Personal Projects</w:t>
+      </w:r>
+    </w:p>
+    <w:p>
+      <w:pPr>
+        <w:spacing w:after="15"/>
+        <w:keepNext/>
+      </w:pPr>
+      <w:r>
+        <w:rPr>
+          <w:rFonts w:ascii="Calibri" w:cs="Calibri" w:eastAsia="Calibri" w:hAnsi="Calibri"/>
+          <w:b/>
+          <w:bCs/>
+          <w:color w:val="1A1A1A"/>
+          <w:sz w:val="21"/>
+          <w:szCs w:val="21"/>
+        </w:rPr>
+        <w:t>SignageFlow — Digital Signage Manager (Personal project)</w:t>
+      </w:r>
+    </w:p>
+    <w:p>
+      <w:pPr>
+        <w:spacing w:after="60"/>
+      </w:pPr>
+      <w:r>
+        <w:rPr>
+          <w:rFonts w:ascii="Calibri" w:cs="Calibri" w:eastAsia="Calibri" w:hAnsi="Calibri"/>
+          <w:color w:val="1A1A1A"/>
+          <w:sz w:val="21"/>
+          <w:szCs w:val="21"/>
+        </w:rPr>
+        <w:t>Multi-tenant digital signage management platform for in-store screens, with code-based device pairing and organization/location-scoped access control. Own architecture, data model, and code — Angular, Node.js/Express, TypeScript, Prisma, SQL Server.</w:t>
+      </w:r>
+    </w:p>
+    <w:p>
+      <w:pPr>
+        <w:spacing w:after="15"/>
+        <w:keepNext/>
+      </w:pPr>
+      <w:r>
+        <w:rPr>
+          <w:rFonts w:ascii="Calibri" w:cs="Calibri" w:eastAsia="Calibri" w:hAnsi="Calibri"/>
+          <w:b/>
+          <w:bCs/>
+          <w:color w:val="1A1A1A"/>
+          <w:sz w:val="21"/>
+          <w:szCs w:val="21"/>
+        </w:rPr>
+        <w:t>Meter-Based Billing App (Freelance)</w:t>
+      </w:r>
+    </w:p>
+    <w:p>
+      <w:pPr>
+        <w:spacing w:after="60"/>
+      </w:pPr>
+      <w:r>
+        <w:rPr>
+          <w:rFonts w:ascii="Calibri" w:cs="Calibri" w:eastAsia="Calibri" w:hAnsi="Calibri"/>
+          <w:color w:val="1A1A1A"/>
+          <w:sz w:val="21"/>
+          <w:szCs w:val="21"/>
+        </w:rPr>
+        <w:t>Billing management PWA built as freelance work for a self-employed contractor in Florida, US. React, TypeScript, Supabase — live and in real use by the client.</w:t>
       </w:r>
     </w:p>
     <w:p>

</xml_diff>